<commit_message>
Standards de realisme appliques a tous les DOCX + fix veille tarifaire
</commit_message>
<xml_diff>
--- a/Rapport_Astra_Momentum_2026-08-13.docx
+++ b/Rapport_Astra_Momentum_2026-08-13.docx
@@ -202,7 +202,7 @@
           <w:rFonts w:ascii="Calibri" w:hAnsi="Calibri"/>
           <w:sz w:val="21"/>
         </w:rPr>
-        <w:t>7 articles et 0 opportunites retenus cette semaine.</w:t>
+        <w:t>7 articles et 5 opportunites retenus cette semaine.</w:t>
       </w:r>
     </w:p>
     <w:tbl>
@@ -421,7 +421,7 @@
                 <w:rFonts w:ascii="Calibri" w:hAnsi="Calibri"/>
                 <w:sz w:val="18"/>
               </w:rPr>
-              <w:t>Transformer 1 signal en post LinkedIn</w:t>
+              <w:t>Enrichir le discours commercial</w:t>
             </w:r>
           </w:p>
         </w:tc>
@@ -505,7 +505,7 @@
                 <w:rFonts w:ascii="Calibri" w:hAnsi="Calibri"/>
                 <w:sz w:val="18"/>
               </w:rPr>
-              <w:t>Aucune opportunite</w:t>
+              <w:t>5 opportunites retenues</w:t>
             </w:r>
           </w:p>
         </w:tc>
@@ -559,7 +559,7 @@
                 <w:rFonts w:ascii="Calibri" w:hAnsi="Calibri"/>
                 <w:sz w:val="18"/>
               </w:rPr>
-              <w:t>N/A</w:t>
+              <w:t>Haute</w:t>
             </w:r>
           </w:p>
         </w:tc>
@@ -660,7 +660,7 @@
           <w:rFonts w:ascii="Calibri" w:hAnsi="Calibri"/>
           <w:sz w:val="21"/>
         </w:rPr>
-        <w:t>En bref : In our last article, we argued that especially in the age of AI, we are all builders, but that there is a very meaningful difference between building to learn (known as product discovery) versus building to earn (known as product delivery).</w:t>
+        <w:t>we argued that especially in the age of AI, we are all builders, but that there is a very meaningful difference between building to learn (known as product discovery) versus building to earn (known as product delivery).</w:t>
       </w:r>
     </w:p>
     <w:p>
@@ -718,7 +718,7 @@
           <w:rFonts w:ascii="Calibri" w:hAnsi="Calibri"/>
           <w:sz w:val="21"/>
         </w:rPr>
-        <w:t>En bref : Listen to this episode on: Spotify | Apple Podcasts How do you build trustworthy AI diagnostic tools in one of medicine's most historically under-researched areas? In this episode of Just Now Possible , Teresa Torres talks with Tulsi Patel (Director of Product and Technology), Lorna Brightmore (Head of.</w:t>
+        <w:t>How do you build trustworthy AI diagnostic tools in one of medicine's most historically under-researched areas? In this episode of Just Now Possible , Teresa Torres talks with Tulsi Patel (Director of Product and Technology), Lorna Brightmore (Head of.</w:t>
       </w:r>
     </w:p>
     <w:p>
@@ -776,7 +776,7 @@
           <w:rFonts w:ascii="Calibri" w:hAnsi="Calibri"/>
           <w:sz w:val="21"/>
         </w:rPr>
-        <w:t>En bref : There’s been a fair bit of publicity of the Open AI “rogue agent” that hacked into Hugging Face .</w:t>
+        <w:t>There’s been a fair bit of publicity of the Open AI “rogue agent” that hacked into Hugging Face.</w:t>
       </w:r>
     </w:p>
     <w:p>
@@ -793,123 +793,7 @@
           <w:color w:val="0B2545"/>
           <w:sz w:val="23"/>
         </w:rPr>
-        <w:t>4. Accueil - Agents-Immo.Fr</w:t>
-      </w:r>
-    </w:p>
-    <w:p>
-      <w:pPr>
-        <w:spacing w:after="40" w:line="264" w:lineRule="auto"/>
-      </w:pPr>
-      <w:r>
-        <w:rPr>
-          <w:rFonts w:ascii="Calibri" w:hAnsi="Calibri"/>
-          <w:b/>
-          <w:color w:val="565F6C"/>
-          <w:sz w:val="19"/>
-        </w:rPr>
-        <w:t>Source : agents-immo.fr</w:t>
-      </w:r>
-    </w:p>
-    <w:p>
-      <w:pPr>
-        <w:spacing w:after="80" w:line="264" w:lineRule="auto"/>
-      </w:pPr>
-      <w:hyperlink r:id="rId14">
-        <w:r>
-          <w:rPr>
-            <w:color w:val="0563C1"/>
-            <w:u w:val="single"/>
-          </w:rPr>
-          <w:t>https://www.agents-immo.fr/</w:t>
-        </w:r>
-      </w:hyperlink>
-    </w:p>
-    <w:p>
-      <w:pPr>
-        <w:pStyle w:val="ListBullet"/>
-        <w:spacing w:after="80"/>
-      </w:pPr>
-      <w:r>
-        <w:rPr>
-          <w:rFonts w:ascii="Calibri" w:hAnsi="Calibri"/>
-          <w:sz w:val="21"/>
-        </w:rPr>
-        <w:t>En bref : La Compagnie des Agents est un réseau national d’agents commerciaux indépendants à taille humaine.</w:t>
-      </w:r>
-    </w:p>
-    <w:p>
-      <w:pPr>
-        <w:pStyle w:val="Heading3"/>
-        <w:pBdr>
-          <w:left w:val="single" w:sz="28" w:space="8" w:color="005B96"/>
-        </w:pBdr>
-      </w:pPr>
-      <w:r>
-        <w:rPr>
-          <w:rFonts w:ascii="Calibri" w:hAnsi="Calibri"/>
-          <w:b/>
-          <w:color w:val="0B2545"/>
-          <w:sz w:val="23"/>
-        </w:rPr>
-        <w:t>5. AI agents | Claude by Anthropic</w:t>
-      </w:r>
-    </w:p>
-    <w:p>
-      <w:pPr>
-        <w:spacing w:after="40" w:line="264" w:lineRule="auto"/>
-      </w:pPr>
-      <w:r>
-        <w:rPr>
-          <w:rFonts w:ascii="Calibri" w:hAnsi="Calibri"/>
-          <w:b/>
-          <w:color w:val="565F6C"/>
-          <w:sz w:val="19"/>
-        </w:rPr>
-        <w:t>Source : claude.com</w:t>
-      </w:r>
-    </w:p>
-    <w:p>
-      <w:pPr>
-        <w:spacing w:after="80" w:line="264" w:lineRule="auto"/>
-      </w:pPr>
-      <w:hyperlink r:id="rId15">
-        <w:r>
-          <w:rPr>
-            <w:color w:val="0563C1"/>
-            <w:u w:val="single"/>
-          </w:rPr>
-          <w:t>https://claude.com/solutions/agents</w:t>
-        </w:r>
-      </w:hyperlink>
-    </w:p>
-    <w:p>
-      <w:pPr>
-        <w:pStyle w:val="ListBullet"/>
-        <w:spacing w:after="80"/>
-      </w:pPr>
-      <w:r>
-        <w:rPr>
-          <w:rFonts w:ascii="Calibri" w:hAnsi="Calibri"/>
-          <w:sz w:val="21"/>
-        </w:rPr>
-        <w:t>En bref : Build powerful AI agents that reason through complex problems and execute tasks autonomously with reliable results..</w:t>
-      </w:r>
-    </w:p>
-    <w:p>
-      <w:pPr>
-        <w:pStyle w:val="Heading3"/>
-        <w:pBdr>
-          <w:left w:val="single" w:sz="28" w:space="8" w:color="005B96"/>
-        </w:pBdr>
-      </w:pPr>
-      <w:r>
-        <w:rPr>
-          <w:rFonts w:ascii="Calibri" w:hAnsi="Calibri"/>
-          <w:b/>
-          <w:color w:val="0B2545"/>
-          <w:sz w:val="23"/>
-        </w:rPr>
-        <w:t>6. Building Reliable Agentic AI Systems</w:t>
+        <w:t>4. Building Reliable Agentic AI Systems</w:t>
       </w:r>
     </w:p>
     <w:p>
@@ -930,7 +814,7 @@
       <w:pPr>
         <w:spacing w:after="80" w:line="264" w:lineRule="auto"/>
       </w:pPr>
-      <w:hyperlink r:id="rId16">
+      <w:hyperlink r:id="rId14">
         <w:r>
           <w:rPr>
             <w:color w:val="0563C1"/>
@@ -950,7 +834,7 @@
           <w:rFonts w:ascii="Calibri" w:hAnsi="Calibri"/>
           <w:sz w:val="21"/>
         </w:rPr>
-        <w:t>En bref : One of the most interesting projects my colleagues have done with LLMs has been building a system with Bayer to allow pharmaceutical researchers to query decades of information about studies buried in PDF reports.</w:t>
+        <w:t>One of the most interesting projects my colleagues have done with LLMs has been building a system with Bayer to allow pharmaceutical researchers to query decades of information about studies buried in PDF reports.</w:t>
       </w:r>
     </w:p>
     <w:p>
@@ -967,7 +851,7 @@
           <w:color w:val="0B2545"/>
           <w:sz w:val="23"/>
         </w:rPr>
-        <w:t>7. The Orchestrator's Tax</w:t>
+        <w:t>5. The Orchestrator's Tax</w:t>
       </w:r>
     </w:p>
     <w:p>
@@ -988,7 +872,7 @@
       <w:pPr>
         <w:spacing w:after="80" w:line="264" w:lineRule="auto"/>
       </w:pPr>
-      <w:hyperlink r:id="rId17">
+      <w:hyperlink r:id="rId15">
         <w:r>
           <w:rPr>
             <w:color w:val="0563C1"/>
@@ -1008,7 +892,123 @@
           <w:rFonts w:ascii="Calibri" w:hAnsi="Calibri"/>
           <w:sz w:val="21"/>
         </w:rPr>
-        <w:t>En bref : Subagents get justified by time saved and parallel execution, but Rahul Garg explains that's not what matters most.</w:t>
+        <w:t>Subagents get justified by time saved and parallel execution, but Rahul Garg explains that's not what matters most.</w:t>
+      </w:r>
+    </w:p>
+    <w:p>
+      <w:pPr>
+        <w:pStyle w:val="Heading3"/>
+        <w:pBdr>
+          <w:left w:val="single" w:sz="28" w:space="8" w:color="005B96"/>
+        </w:pBdr>
+      </w:pPr>
+      <w:r>
+        <w:rPr>
+          <w:rFonts w:ascii="Calibri" w:hAnsi="Calibri"/>
+          <w:b/>
+          <w:color w:val="0B2545"/>
+          <w:sz w:val="23"/>
+        </w:rPr>
+        <w:t>6. Ch. 9: Identifying Hidden Assumptions</w:t>
+      </w:r>
+    </w:p>
+    <w:p>
+      <w:pPr>
+        <w:spacing w:after="40" w:line="264" w:lineRule="auto"/>
+      </w:pPr>
+      <w:r>
+        <w:rPr>
+          <w:rFonts w:ascii="Calibri" w:hAnsi="Calibri"/>
+          <w:b/>
+          <w:color w:val="565F6C"/>
+          <w:sz w:val="19"/>
+        </w:rPr>
+        <w:t>Source : Product Talk</w:t>
+      </w:r>
+    </w:p>
+    <w:p>
+      <w:pPr>
+        <w:spacing w:after="80" w:line="264" w:lineRule="auto"/>
+      </w:pPr>
+      <w:hyperlink r:id="rId16">
+        <w:r>
+          <w:rPr>
+            <w:color w:val="0563C1"/>
+            <w:u w:val="single"/>
+          </w:rPr>
+          <w:t>https://www.producttalk.org/cdh-book-club-august-2026/</w:t>
+        </w:r>
+      </w:hyperlink>
+    </w:p>
+    <w:p>
+      <w:pPr>
+        <w:pStyle w:val="ListBullet"/>
+        <w:spacing w:after="80"/>
+      </w:pPr>
+      <w:r>
+        <w:rPr>
+          <w:rFonts w:ascii="Calibri" w:hAnsi="Calibri"/>
+          <w:sz w:val="21"/>
+        </w:rPr>
+        <w:t>Continuous Discovery Habits turns five this year.</w:t>
+      </w:r>
+    </w:p>
+    <w:p>
+      <w:pPr>
+        <w:pStyle w:val="Heading3"/>
+        <w:pBdr>
+          <w:left w:val="single" w:sz="28" w:space="8" w:color="005B96"/>
+        </w:pBdr>
+      </w:pPr>
+      <w:r>
+        <w:rPr>
+          <w:rFonts w:ascii="Calibri" w:hAnsi="Calibri"/>
+          <w:b/>
+          <w:color w:val="0B2545"/>
+          <w:sz w:val="23"/>
+        </w:rPr>
+        <w:t>7. A Fresh Definition of The Product Role</w:t>
+      </w:r>
+    </w:p>
+    <w:p>
+      <w:pPr>
+        <w:spacing w:after="40" w:line="264" w:lineRule="auto"/>
+      </w:pPr>
+      <w:r>
+        <w:rPr>
+          <w:rFonts w:ascii="Calibri" w:hAnsi="Calibri"/>
+          <w:b/>
+          <w:color w:val="565F6C"/>
+          <w:sz w:val="19"/>
+        </w:rPr>
+        <w:t>Source : SVPG</w:t>
+      </w:r>
+    </w:p>
+    <w:p>
+      <w:pPr>
+        <w:spacing w:after="80" w:line="264" w:lineRule="auto"/>
+      </w:pPr>
+      <w:hyperlink r:id="rId17">
+        <w:r>
+          <w:rPr>
+            <w:color w:val="0563C1"/>
+            <w:u w:val="single"/>
+          </w:rPr>
+          <w:t>https://www.svpg.com/a-fresh-definition-of-the-product-role/</w:t>
+        </w:r>
+      </w:hyperlink>
+    </w:p>
+    <w:p>
+      <w:pPr>
+        <w:pStyle w:val="ListBullet"/>
+        <w:spacing w:after="80"/>
+      </w:pPr>
+      <w:r>
+        <w:rPr>
+          <w:rFonts w:ascii="Calibri" w:hAnsi="Calibri"/>
+          <w:sz w:val="21"/>
+        </w:rPr>
+        <w:t>I’m just guessing here, but I’d say over the years I’ve seen at least one hundred different definitions of the product role (i.e.</w:t>
       </w:r>
     </w:p>
     <w:p>
@@ -1038,6 +1038,51 @@
     </w:p>
     <w:p>
       <w:pPr>
+        <w:pStyle w:val="Heading3"/>
+        <w:pBdr>
+          <w:left w:val="single" w:sz="28" w:space="8" w:color="005B96"/>
+        </w:pBdr>
+      </w:pPr>
+      <w:r>
+        <w:rPr>
+          <w:rFonts w:ascii="Calibri" w:hAnsi="Calibri"/>
+          <w:b/>
+          <w:color w:val="0B2545"/>
+          <w:sz w:val="23"/>
+        </w:rPr>
+        <w:t>1. CELAD - Offre d'emploi Product Owner PIM (H/F) Lille (59) | Free-work</w:t>
+      </w:r>
+    </w:p>
+    <w:p>
+      <w:pPr>
+        <w:spacing w:after="40" w:line="264" w:lineRule="auto"/>
+      </w:pPr>
+      <w:r>
+        <w:rPr>
+          <w:rFonts w:ascii="Calibri" w:hAnsi="Calibri"/>
+          <w:b/>
+          <w:color w:val="565F6C"/>
+          <w:sz w:val="19"/>
+        </w:rPr>
+        <w:t>Plateforme : free-work.com</w:t>
+      </w:r>
+    </w:p>
+    <w:p>
+      <w:pPr>
+        <w:spacing w:after="80" w:line="264" w:lineRule="auto"/>
+      </w:pPr>
+      <w:hyperlink r:id="rId18">
+        <w:r>
+          <w:rPr>
+            <w:color w:val="0563C1"/>
+            <w:u w:val="single"/>
+          </w:rPr>
+          <w:t>https://www.free-work.com/fr/tech-it/job-mission/product-owner/product-owner-pim-h-f-2</w:t>
+        </w:r>
+      </w:hyperlink>
+    </w:p>
+    <w:p>
+      <w:pPr>
         <w:pStyle w:val="ListBullet"/>
         <w:spacing w:after="80"/>
       </w:pPr>
@@ -1046,7 +1091,239 @@
           <w:rFonts w:ascii="Calibri" w:hAnsi="Calibri"/>
           <w:sz w:val="21"/>
         </w:rPr>
-        <w:t>Aucune opportunite identifiee cette semaine.</w:t>
+        <w:t>Dans le cadre d’un projet de transformation digitale, nous recherchons un Product Owner disposant d’une expérience sur des projets PIM..</w:t>
+      </w:r>
+    </w:p>
+    <w:p>
+      <w:pPr>
+        <w:pStyle w:val="Heading3"/>
+        <w:pBdr>
+          <w:left w:val="single" w:sz="28" w:space="8" w:color="005B96"/>
+        </w:pBdr>
+      </w:pPr>
+      <w:r>
+        <w:rPr>
+          <w:rFonts w:ascii="Calibri" w:hAnsi="Calibri"/>
+          <w:b/>
+          <w:color w:val="0B2545"/>
+          <w:sz w:val="23"/>
+        </w:rPr>
+        <w:t>2. FRISBEE PROFILING - Mission freelance Digital Product Owner E-commerce (H/F) Essonne | Free-work</w:t>
+      </w:r>
+    </w:p>
+    <w:p>
+      <w:pPr>
+        <w:spacing w:after="40" w:line="264" w:lineRule="auto"/>
+      </w:pPr>
+      <w:r>
+        <w:rPr>
+          <w:rFonts w:ascii="Calibri" w:hAnsi="Calibri"/>
+          <w:b/>
+          <w:color w:val="565F6C"/>
+          <w:sz w:val="19"/>
+        </w:rPr>
+        <w:t>Plateforme : free-work.com</w:t>
+      </w:r>
+    </w:p>
+    <w:p>
+      <w:pPr>
+        <w:spacing w:after="80" w:line="264" w:lineRule="auto"/>
+      </w:pPr>
+      <w:hyperlink r:id="rId19">
+        <w:r>
+          <w:rPr>
+            <w:color w:val="0563C1"/>
+            <w:u w:val="single"/>
+          </w:rPr>
+          <w:t>https://www.free-work.com/fr/tech-it/job-mission/chef-de-projet-e-commerce/digital-product-owner-e-commerce-h-f</w:t>
+        </w:r>
+      </w:hyperlink>
+    </w:p>
+    <w:p>
+      <w:pPr>
+        <w:pStyle w:val="ListBullet"/>
+        <w:spacing w:after="80"/>
+      </w:pPr>
+      <w:r>
+        <w:rPr>
+          <w:rFonts w:ascii="Calibri" w:hAnsi="Calibri"/>
+          <w:sz w:val="21"/>
+        </w:rPr>
+        <w:t>Nous cherchons pour notre client un Digital Product Owner (H/F).</w:t>
+      </w:r>
+    </w:p>
+    <w:p>
+      <w:pPr>
+        <w:pStyle w:val="Heading3"/>
+        <w:pBdr>
+          <w:left w:val="single" w:sz="28" w:space="8" w:color="005B96"/>
+        </w:pBdr>
+      </w:pPr>
+      <w:r>
+        <w:rPr>
+          <w:rFonts w:ascii="Calibri" w:hAnsi="Calibri"/>
+          <w:b/>
+          <w:color w:val="0B2545"/>
+          <w:sz w:val="23"/>
+        </w:rPr>
+        <w:t>3. Wekey - Mission freelance Product Owner H/F Brest (29) | Free-work</w:t>
+      </w:r>
+    </w:p>
+    <w:p>
+      <w:pPr>
+        <w:spacing w:after="40" w:line="264" w:lineRule="auto"/>
+      </w:pPr>
+      <w:r>
+        <w:rPr>
+          <w:rFonts w:ascii="Calibri" w:hAnsi="Calibri"/>
+          <w:b/>
+          <w:color w:val="565F6C"/>
+          <w:sz w:val="19"/>
+        </w:rPr>
+        <w:t>Plateforme : free-work.com</w:t>
+      </w:r>
+    </w:p>
+    <w:p>
+      <w:pPr>
+        <w:spacing w:after="80" w:line="264" w:lineRule="auto"/>
+      </w:pPr>
+      <w:hyperlink r:id="rId20">
+        <w:r>
+          <w:rPr>
+            <w:color w:val="0563C1"/>
+            <w:u w:val="single"/>
+          </w:rPr>
+          <w:t>https://www.free-work.com/fr/tech-it/job-mission/product-owner/product-owner-h-f-1247</w:t>
+        </w:r>
+      </w:hyperlink>
+    </w:p>
+    <w:p>
+      <w:pPr>
+        <w:pStyle w:val="ListBullet"/>
+        <w:spacing w:after="80"/>
+      </w:pPr>
+      <w:r>
+        <w:rPr>
+          <w:rFonts w:ascii="Calibri" w:hAnsi="Calibri"/>
+          <w:sz w:val="21"/>
+        </w:rPr>
+        <w:t>Hello ! Nous c’est WEKEY ! Nous ne sommes ni une ESN ni un cabinet de recrutement.</w:t>
+      </w:r>
+    </w:p>
+    <w:p>
+      <w:pPr>
+        <w:pStyle w:val="Heading3"/>
+        <w:pBdr>
+          <w:left w:val="single" w:sz="28" w:space="8" w:color="005B96"/>
+        </w:pBdr>
+      </w:pPr>
+      <w:r>
+        <w:rPr>
+          <w:rFonts w:ascii="Calibri" w:hAnsi="Calibri"/>
+          <w:b/>
+          <w:color w:val="0B2545"/>
+          <w:sz w:val="23"/>
+        </w:rPr>
+        <w:t>4. Mindquest - Mission freelance Product Owner (H/F) 69 Lyon (69) | Free-work</w:t>
+      </w:r>
+    </w:p>
+    <w:p>
+      <w:pPr>
+        <w:spacing w:after="40" w:line="264" w:lineRule="auto"/>
+      </w:pPr>
+      <w:r>
+        <w:rPr>
+          <w:rFonts w:ascii="Calibri" w:hAnsi="Calibri"/>
+          <w:b/>
+          <w:color w:val="565F6C"/>
+          <w:sz w:val="19"/>
+        </w:rPr>
+        <w:t>Plateforme : free-work.com</w:t>
+      </w:r>
+    </w:p>
+    <w:p>
+      <w:pPr>
+        <w:spacing w:after="80" w:line="264" w:lineRule="auto"/>
+      </w:pPr>
+      <w:hyperlink r:id="rId21">
+        <w:r>
+          <w:rPr>
+            <w:color w:val="0563C1"/>
+            <w:u w:val="single"/>
+          </w:rPr>
+          <w:t>https://www.free-work.com/fr/tech-it/job-mission/product-owner/product-owner-h-f-69-1</w:t>
+        </w:r>
+      </w:hyperlink>
+    </w:p>
+    <w:p>
+      <w:pPr>
+        <w:pStyle w:val="ListBullet"/>
+        <w:spacing w:after="80"/>
+      </w:pPr>
+      <w:r>
+        <w:rPr>
+          <w:rFonts w:ascii="Calibri" w:hAnsi="Calibri"/>
+          <w:sz w:val="21"/>
+        </w:rPr>
+        <w:t>Context Dans le cadre d’une mission longue pour un acteur majeur du secteur bancaire, nous recherchons un Product Owner Senior pour.</w:t>
+      </w:r>
+    </w:p>
+    <w:p>
+      <w:pPr>
+        <w:pStyle w:val="Heading3"/>
+        <w:pBdr>
+          <w:left w:val="single" w:sz="28" w:space="8" w:color="005B96"/>
+        </w:pBdr>
+      </w:pPr>
+      <w:r>
+        <w:rPr>
+          <w:rFonts w:ascii="Calibri" w:hAnsi="Calibri"/>
+          <w:b/>
+          <w:color w:val="0B2545"/>
+          <w:sz w:val="23"/>
+        </w:rPr>
+        <w:t>5. PROPULSE IT - Mission freelance Product Owner / QA - e-commerce Versailles (78) | Free-work</w:t>
+      </w:r>
+    </w:p>
+    <w:p>
+      <w:pPr>
+        <w:spacing w:after="40" w:line="264" w:lineRule="auto"/>
+      </w:pPr>
+      <w:r>
+        <w:rPr>
+          <w:rFonts w:ascii="Calibri" w:hAnsi="Calibri"/>
+          <w:b/>
+          <w:color w:val="565F6C"/>
+          <w:sz w:val="19"/>
+        </w:rPr>
+        <w:t>Plateforme : free-work.com</w:t>
+      </w:r>
+    </w:p>
+    <w:p>
+      <w:pPr>
+        <w:spacing w:after="80" w:line="264" w:lineRule="auto"/>
+      </w:pPr>
+      <w:hyperlink r:id="rId22">
+        <w:r>
+          <w:rPr>
+            <w:color w:val="0563C1"/>
+            <w:u w:val="single"/>
+          </w:rPr>
+          <w:t>https://www.free-work.com/fr/tech-it/job-mission/chef-de-projet-e-commerce/product-owner-qa-e-commerce-18</w:t>
+        </w:r>
+      </w:hyperlink>
+    </w:p>
+    <w:p>
+      <w:pPr>
+        <w:pStyle w:val="ListBullet"/>
+        <w:spacing w:after="80"/>
+      </w:pPr>
+      <w:r>
+        <w:rPr>
+          <w:rFonts w:ascii="Calibri" w:hAnsi="Calibri"/>
+          <w:sz w:val="21"/>
+        </w:rPr>
+        <w:t>Pour l'un de nos clients, nous recherchons un(e) Product Owner / QA avec expériences e-commerce impérative Contexte Pour.</w:t>
       </w:r>
     </w:p>
     <w:p>
@@ -1093,7 +1370,7 @@
           <w:rFonts w:ascii="Calibri" w:hAnsi="Calibri"/>
           <w:sz w:val="21"/>
         </w:rPr>
-        <w:t>Definition : Approche d'organisation des equipes tech/produit autour des flux de valeur, plateformes et charge cognitive.</w:t>
+        <w:t>Approche d'organisation des equipes tech/produit autour des flux de valeur, plateformes et charge cognitive.</w:t>
       </w:r>
     </w:p>
     <w:p>
@@ -1106,7 +1383,7 @@
           <w:rFonts w:ascii="Calibri" w:hAnsi="Calibri"/>
           <w:sz w:val="21"/>
         </w:rPr>
-        <w:t>Interet business : Aide a identifier pourquoi le delivery ralentit malgre les rituels agiles.</w:t>
+        <w:t>Interet pour les clients : Aide a identifier pourquoi le delivery ralentit malgre les rituels agiles.</w:t>
       </w:r>
     </w:p>
     <w:p>
@@ -1119,7 +1396,7 @@
           <w:rFonts w:ascii="Calibri" w:hAnsi="Calibri"/>
           <w:sz w:val="21"/>
         </w:rPr>
-        <w:t>Cas d'utilisation client : Revue d'organisation, dependances, plateformes internes, friction entre equipes.</w:t>
+        <w:t>Quand l'utiliser : Revue d'organisation, dependances, plateformes internes, friction entre equipes.</w:t>
       </w:r>
     </w:p>
     <w:p>
@@ -1132,7 +1409,7 @@
           <w:rFonts w:ascii="Calibri" w:hAnsi="Calibri"/>
           <w:sz w:val="21"/>
         </w:rPr>
-        <w:t>Usage commercial pour la societe : Nourrir des diagnostics delivery et transformation digitale.</w:t>
+        <w:t>Comment en parler : Nourrir des diagnostics delivery et transformation digitale.</w:t>
       </w:r>
     </w:p>
     <w:p>
@@ -1148,7 +1425,7 @@
         </w:rPr>
         <w:t xml:space="preserve">Source : </w:t>
       </w:r>
-      <w:hyperlink r:id="rId18">
+      <w:hyperlink r:id="rId23">
         <w:r>
           <w:rPr>
             <w:color w:val="0563C1"/>
@@ -1185,7 +1462,7 @@
           <w:rFonts w:ascii="Calibri" w:hAnsi="Calibri"/>
           <w:sz w:val="21"/>
         </w:rPr>
-        <w:t>Definition : Methode Basecamp pour cadrer, parier et livrer des cycles produits avec un appetit de temps clair.</w:t>
+        <w:t>Methode Basecamp pour cadrer, parier et livrer des cycles produits avec un appetit de temps clair.</w:t>
       </w:r>
     </w:p>
     <w:p>
@@ -1198,7 +1475,7 @@
           <w:rFonts w:ascii="Calibri" w:hAnsi="Calibri"/>
           <w:sz w:val="21"/>
         </w:rPr>
-        <w:t>Interet business : Aide les organisations a sortir des backlogs infinis et a mieux cadrer les paris produit.</w:t>
+        <w:t>Interet pour les clients : Aide les organisations a sortir des backlogs infinis et a mieux cadrer les paris produit.</w:t>
       </w:r>
     </w:p>
     <w:p>
@@ -1211,7 +1488,7 @@
           <w:rFonts w:ascii="Calibri" w:hAnsi="Calibri"/>
           <w:sz w:val="21"/>
         </w:rPr>
-        <w:t>Cas d'utilisation client : Cadrage de problemes, scopes variables, cycles de delivery courts.</w:t>
+        <w:t>Quand l'utiliser : Cadrage de problemes, scopes variables, cycles de delivery courts.</w:t>
       </w:r>
     </w:p>
     <w:p>
@@ -1224,7 +1501,7 @@
           <w:rFonts w:ascii="Calibri" w:hAnsi="Calibri"/>
           <w:sz w:val="21"/>
         </w:rPr>
-        <w:t>Usage commercial pour la societe : Proposer un format de cadrage executive avant sprint ou pilote IA.</w:t>
+        <w:t>Comment en parler : Proposer un format de cadrage executive avant sprint ou pilote IA.</w:t>
       </w:r>
     </w:p>
     <w:p>
@@ -1240,7 +1517,7 @@
         </w:rPr>
         <w:t xml:space="preserve">Source : </w:t>
       </w:r>
-      <w:hyperlink r:id="rId19">
+      <w:hyperlink r:id="rId24">
         <w:r>
           <w:rPr>
             <w:color w:val="0563C1"/>
@@ -1277,7 +1554,7 @@
           <w:rFonts w:ascii="Calibri" w:hAnsi="Calibri"/>
           <w:sz w:val="21"/>
         </w:rPr>
-        <w:t>Definition : Cadre legal et fiscal de la SASU : responsabilite limitee au capital, cotisations sociales sur salaire, dividendes, TVA franchise en deça de 37 500EUR de CA.</w:t>
+        <w:t>Cadre legal et fiscal de la SASU : responsabilite limitee au capital, cotisations sociales sur salaire, dividendes, TVA franchise en deça de 37 500EUR de CA.</w:t>
       </w:r>
     </w:p>
     <w:p>
@@ -1290,7 +1567,7 @@
           <w:rFonts w:ascii="Calibri" w:hAnsi="Calibri"/>
           <w:sz w:val="21"/>
         </w:rPr>
-        <w:t>Interet business : Permet de conseiller des dirigeants de PME sur le statut SASU vs EI vs EURL et d'identifier les leviers d'optimisation.</w:t>
+        <w:t>Interet pour les clients : Permet de conseiller des dirigeants de PME sur le statut SASU vs EI vs EURL et d'identifier les leviers d'optimisation.</w:t>
       </w:r>
     </w:p>
     <w:p>
@@ -1303,7 +1580,7 @@
           <w:rFonts w:ascii="Calibri" w:hAnsi="Calibri"/>
           <w:sz w:val="21"/>
         </w:rPr>
-        <w:t>Cas d'utilisation client : Clients dirigeants de PME/ETI en freelance ou portage. Sujet recurrent dans les echanges coachings.</w:t>
+        <w:t>Quand l'utiliser : Clients dirigeants de PME/ETI en freelance ou portage. Sujet recurrent dans les echanges coachings.</w:t>
       </w:r>
     </w:p>
     <w:p>
@@ -1316,7 +1593,7 @@
           <w:rFonts w:ascii="Calibri" w:hAnsi="Calibri"/>
           <w:sz w:val="21"/>
         </w:rPr>
-        <w:t>Usage commercial pour la societe : Argumentaire pour missions de conseil strategique aupres de dirigeants de PME.</w:t>
+        <w:t>Comment en parler : Argumentaire pour missions de conseil strategique aupres de dirigeants de PME.</w:t>
       </w:r>
     </w:p>
     <w:p>
@@ -1332,7 +1609,7 @@
         </w:rPr>
         <w:t xml:space="preserve">Source : </w:t>
       </w:r>
-      <w:hyperlink r:id="rId20">
+      <w:hyperlink r:id="rId25">
         <w:r>
           <w:rPr>
             <w:color w:val="0563C1"/>
@@ -1369,7 +1646,7 @@
           <w:rFonts w:ascii="Calibri" w:hAnsi="Calibri"/>
           <w:sz w:val="21"/>
         </w:rPr>
-        <w:t>Definition : Reference officielle Scrum recentrant l'equipe sur Product Goal, Sprint Goal et Definition of Done.</w:t>
+        <w:t>Reference officielle Scrum recentrant l'equipe sur Product Goal, Sprint Goal et Definition of Done.</w:t>
       </w:r>
     </w:p>
     <w:p>
@@ -1382,7 +1659,7 @@
           <w:rFonts w:ascii="Calibri" w:hAnsi="Calibri"/>
           <w:sz w:val="21"/>
         </w:rPr>
-        <w:t>Interet business : Permet de distinguer agilité utile et ceremonies sans impact.</w:t>
+        <w:t>Interet pour les clients : Permet de distinguer agilité utile et ceremonies sans impact.</w:t>
       </w:r>
     </w:p>
     <w:p>
@@ -1395,7 +1672,7 @@
           <w:rFonts w:ascii="Calibri" w:hAnsi="Calibri"/>
           <w:sz w:val="21"/>
         </w:rPr>
-        <w:t>Cas d'utilisation client : Audit agile, clarification du role PO, evaluation de la valeur livree.</w:t>
+        <w:t>Quand l'utiliser : Audit agile, clarification du role PO, evaluation de la valeur livree.</w:t>
       </w:r>
     </w:p>
     <w:p>
@@ -1408,7 +1685,7 @@
           <w:rFonts w:ascii="Calibri" w:hAnsi="Calibri"/>
           <w:sz w:val="21"/>
         </w:rPr>
-        <w:t>Usage commercial pour la societe : Argumentaire pour offres de remise a plat delivery/product.</w:t>
+        <w:t>Comment en parler : Argumentaire pour offres de remise a plat delivery/product.</w:t>
       </w:r>
     </w:p>
     <w:p>
@@ -1424,7 +1701,7 @@
         </w:rPr>
         <w:t xml:space="preserve">Source : </w:t>
       </w:r>
-      <w:hyperlink r:id="rId21">
+      <w:hyperlink r:id="rId26">
         <w:r>
           <w:rPr>
             <w:color w:val="0563C1"/>
@@ -1448,21 +1725,7 @@
           <w:color w:val="0B2545"/>
           <w:sz w:val="30"/>
         </w:rPr>
-        <w:t>5. Recommandations operationnelles</w:t>
-      </w:r>
-    </w:p>
-    <w:p>
-      <w:pPr>
-        <w:pStyle w:val="Heading2"/>
-        <w:spacing w:line="264" w:lineRule="auto"/>
-      </w:pPr>
-      <w:r>
-        <w:rPr>
-          <w:rFonts w:ascii="Calibri" w:hAnsi="Calibri"/>
-          <w:b w:val="0"/>
-          <w:i w:val="0"/>
-        </w:rPr>
-        <w:t>Priorites pour la semaine suivante</w:t>
+        <w:t>5. Priorites de la semaine</w:t>
       </w:r>
     </w:p>
     <w:p>
@@ -1475,7 +1738,7 @@
           <w:rFonts w:ascii="Calibri" w:hAnsi="Calibri"/>
           <w:sz w:val="21"/>
         </w:rPr>
-        <w:t>Qualifier en priorite : la meilleure opportunite identifiee.</w:t>
+        <w:t>A qualifier en premier : CELAD - Offre d'emploi Product Owner PIM (H/F) Lille (59) | Free-work.</w:t>
       </w:r>
     </w:p>
     <w:p>
@@ -1488,278 +1751,8 @@
           <w:rFonts w:ascii="Calibri" w:hAnsi="Calibri"/>
           <w:sz w:val="21"/>
         </w:rPr>
-        <w:t>Utiliser l'article 'Build To Learn FAQ' pour un post LinkedIn cette semaine.</w:t>
+        <w:t>Article a garder sous le coude pour tes prochains echanges : 'Build To Learn FAQ'.</w:t>
       </w:r>
-    </w:p>
-    <w:p>
-      <w:pPr>
-        <w:pStyle w:val="Heading1"/>
-        <w:pBdr>
-          <w:left w:val="single" w:sz="28" w:space="8" w:color="005B96"/>
-        </w:pBdr>
-      </w:pPr>
-      <w:r>
-        <w:rPr>
-          <w:rFonts w:ascii="Calibri" w:hAnsi="Calibri"/>
-          <w:b/>
-          <w:color w:val="0B2545"/>
-          <w:sz w:val="30"/>
-        </w:rPr>
-        <w:t>6. Sources et URLs verifiables</w:t>
-      </w:r>
-    </w:p>
-    <w:p>
-      <w:pPr>
-        <w:spacing w:after="40" w:line="264" w:lineRule="auto"/>
-      </w:pPr>
-      <w:r>
-        <w:rPr>
-          <w:rFonts w:ascii="Calibri" w:hAnsi="Calibri"/>
-          <w:b/>
-          <w:color w:val="565F6C"/>
-          <w:sz w:val="18"/>
-        </w:rPr>
-        <w:t xml:space="preserve">Build To Learn FAQ - </w:t>
-      </w:r>
-      <w:hyperlink r:id="rId11">
-        <w:r>
-          <w:rPr>
-            <w:color w:val="0563C1"/>
-            <w:u w:val="single"/>
-          </w:rPr>
-          <w:t>https://www.svpg.com/build-to-learn-faq/</w:t>
-        </w:r>
-      </w:hyperlink>
-    </w:p>
-    <w:p>
-      <w:pPr>
-        <w:spacing w:after="40" w:line="264" w:lineRule="auto"/>
-      </w:pPr>
-      <w:r>
-        <w:rPr>
-          <w:rFonts w:ascii="Calibri" w:hAnsi="Calibri"/>
-          <w:b/>
-          <w:color w:val="565F6C"/>
-          <w:sz w:val="18"/>
-        </w:rPr>
-        <w:t xml:space="preserve">Building AI for Women's Health: How Hertility Combined Bayesian Diagnosis and Scan Automation - </w:t>
-      </w:r>
-      <w:hyperlink r:id="rId12">
-        <w:r>
-          <w:rPr>
-            <w:color w:val="0563C1"/>
-            <w:u w:val="single"/>
-          </w:rPr>
-          <w:t>https://www.producttalk.org/building-ai-for-womens-health-how-hertility-combined-bayesian-diagnosis-and-scan-automation/</w:t>
-        </w:r>
-      </w:hyperlink>
-    </w:p>
-    <w:p>
-      <w:pPr>
-        <w:spacing w:after="40" w:line="264" w:lineRule="auto"/>
-      </w:pPr>
-      <w:r>
-        <w:rPr>
-          <w:rFonts w:ascii="Calibri" w:hAnsi="Calibri"/>
-          <w:b/>
-          <w:color w:val="565F6C"/>
-          <w:sz w:val="18"/>
-        </w:rPr>
-        <w:t xml:space="preserve">Fragments: August 4 - </w:t>
-      </w:r>
-      <w:hyperlink r:id="rId13">
-        <w:r>
-          <w:rPr>
-            <w:color w:val="0563C1"/>
-            <w:u w:val="single"/>
-          </w:rPr>
-          <w:t>https://martinfowler.com/fragments/2026-08-04.html</w:t>
-        </w:r>
-      </w:hyperlink>
-    </w:p>
-    <w:p>
-      <w:pPr>
-        <w:spacing w:after="40" w:line="264" w:lineRule="auto"/>
-      </w:pPr>
-      <w:r>
-        <w:rPr>
-          <w:rFonts w:ascii="Calibri" w:hAnsi="Calibri"/>
-          <w:b/>
-          <w:color w:val="565F6C"/>
-          <w:sz w:val="18"/>
-        </w:rPr>
-        <w:t xml:space="preserve">Accueil - Agents-Immo.Fr - </w:t>
-      </w:r>
-      <w:hyperlink r:id="rId14">
-        <w:r>
-          <w:rPr>
-            <w:color w:val="0563C1"/>
-            <w:u w:val="single"/>
-          </w:rPr>
-          <w:t>https://www.agents-immo.fr/</w:t>
-        </w:r>
-      </w:hyperlink>
-    </w:p>
-    <w:p>
-      <w:pPr>
-        <w:spacing w:after="40" w:line="264" w:lineRule="auto"/>
-      </w:pPr>
-      <w:r>
-        <w:rPr>
-          <w:rFonts w:ascii="Calibri" w:hAnsi="Calibri"/>
-          <w:b/>
-          <w:color w:val="565F6C"/>
-          <w:sz w:val="18"/>
-        </w:rPr>
-        <w:t xml:space="preserve">AI agents | Claude by Anthropic - </w:t>
-      </w:r>
-      <w:hyperlink r:id="rId15">
-        <w:r>
-          <w:rPr>
-            <w:color w:val="0563C1"/>
-            <w:u w:val="single"/>
-          </w:rPr>
-          <w:t>https://claude.com/solutions/agents</w:t>
-        </w:r>
-      </w:hyperlink>
-    </w:p>
-    <w:p>
-      <w:pPr>
-        <w:spacing w:after="40" w:line="264" w:lineRule="auto"/>
-      </w:pPr>
-      <w:r>
-        <w:rPr>
-          <w:rFonts w:ascii="Calibri" w:hAnsi="Calibri"/>
-          <w:b/>
-          <w:color w:val="565F6C"/>
-          <w:sz w:val="18"/>
-        </w:rPr>
-        <w:t xml:space="preserve">Building Reliable Agentic AI Systems - </w:t>
-      </w:r>
-      <w:hyperlink r:id="rId16">
-        <w:r>
-          <w:rPr>
-            <w:color w:val="0563C1"/>
-            <w:u w:val="single"/>
-          </w:rPr>
-          <w:t>https://martinfowler.com/articles/reliable-llm-bayer.html</w:t>
-        </w:r>
-      </w:hyperlink>
-    </w:p>
-    <w:p>
-      <w:pPr>
-        <w:spacing w:after="40" w:line="264" w:lineRule="auto"/>
-      </w:pPr>
-      <w:r>
-        <w:rPr>
-          <w:rFonts w:ascii="Calibri" w:hAnsi="Calibri"/>
-          <w:b/>
-          <w:color w:val="565F6C"/>
-          <w:sz w:val="18"/>
-        </w:rPr>
-        <w:t xml:space="preserve">The Orchestrator's Tax - </w:t>
-      </w:r>
-      <w:hyperlink r:id="rId17">
-        <w:r>
-          <w:rPr>
-            <w:color w:val="0563C1"/>
-            <w:u w:val="single"/>
-          </w:rPr>
-          <w:t>https://martinfowler.com/articles/orchestrator-tax.html</w:t>
-        </w:r>
-      </w:hyperlink>
-    </w:p>
-    <w:p>
-      <w:pPr>
-        <w:spacing w:after="40" w:line="264" w:lineRule="auto"/>
-      </w:pPr>
-      <w:r>
-        <w:rPr>
-          <w:rFonts w:ascii="Calibri" w:hAnsi="Calibri"/>
-          <w:b/>
-          <w:color w:val="565F6C"/>
-          <w:sz w:val="18"/>
-        </w:rPr>
-        <w:t xml:space="preserve">Team Topologies - </w:t>
-      </w:r>
-      <w:hyperlink r:id="rId18">
-        <w:r>
-          <w:rPr>
-            <w:color w:val="0563C1"/>
-            <w:u w:val="single"/>
-          </w:rPr>
-          <w:t>https://teamtopologies.com/</w:t>
-        </w:r>
-      </w:hyperlink>
-    </w:p>
-    <w:p>
-      <w:pPr>
-        <w:spacing w:after="40" w:line="264" w:lineRule="auto"/>
-      </w:pPr>
-      <w:r>
-        <w:rPr>
-          <w:rFonts w:ascii="Calibri" w:hAnsi="Calibri"/>
-          <w:b/>
-          <w:color w:val="565F6C"/>
-          <w:sz w:val="18"/>
-        </w:rPr>
-        <w:t xml:space="preserve">Shape Up - </w:t>
-      </w:r>
-      <w:hyperlink r:id="rId19">
-        <w:r>
-          <w:rPr>
-            <w:color w:val="0563C1"/>
-            <w:u w:val="single"/>
-          </w:rPr>
-          <w:t>https://basecamp.com/shapeup</w:t>
-        </w:r>
-      </w:hyperlink>
-    </w:p>
-    <w:p>
-      <w:pPr>
-        <w:spacing w:after="40" w:line="264" w:lineRule="auto"/>
-      </w:pPr>
-      <w:r>
-        <w:rPr>
-          <w:rFonts w:ascii="Calibri" w:hAnsi="Calibri"/>
-          <w:b/>
-          <w:color w:val="565F6C"/>
-          <w:sz w:val="18"/>
-        </w:rPr>
-        <w:t xml:space="preserve">Freelance SASU - Optimisation fiscale et sociale - </w:t>
-      </w:r>
-      <w:hyperlink r:id="rId20">
-        <w:r>
-          <w:rPr>
-            <w:color w:val="0563C1"/>
-            <w:u w:val="single"/>
-          </w:rPr>
-          <w:t>https://www.legifrance.gouv.fr/codes/section_lc/LEGITEXT000006069565/LEGISCTA000006191753/</w:t>
-        </w:r>
-      </w:hyperlink>
-    </w:p>
-    <w:p>
-      <w:pPr>
-        <w:spacing w:after="40" w:line="264" w:lineRule="auto"/>
-      </w:pPr>
-      <w:r>
-        <w:rPr>
-          <w:rFonts w:ascii="Calibri" w:hAnsi="Calibri"/>
-          <w:b/>
-          <w:color w:val="565F6C"/>
-          <w:sz w:val="18"/>
-        </w:rPr>
-        <w:t xml:space="preserve">Scrum Guide - Product Goal - </w:t>
-      </w:r>
-      <w:hyperlink r:id="rId21">
-        <w:r>
-          <w:rPr>
-            <w:color w:val="0563C1"/>
-            <w:u w:val="single"/>
-          </w:rPr>
-          <w:t>https://scrumguides.org/scrum-guide.html</w:t>
-        </w:r>
-      </w:hyperlink>
     </w:p>
     <w:p>
       <w:pPr>
@@ -1815,817 +1808,9 @@
           <w:color w:val="0B2545"/>
           <w:sz w:val="25"/>
         </w:rPr>
-        <w:t>B. Routeurs, compresseurs et outils FinOps</w:t>
+        <w:t>B. Outils et initiatives open source</w:t>
       </w:r>
     </w:p>
-    <w:tbl>
-      <w:tblPr>
-        <w:tblW w:type="auto" w:w="0"/>
-        <w:jc w:val="center"/>
-        <w:tblLayout w:type="fixed"/>
-        <w:tblLook w:firstColumn="1" w:firstRow="1" w:lastColumn="0" w:lastRow="0" w:noHBand="0" w:noVBand="1" w:val="04A0"/>
-      </w:tblPr>
-      <w:tblGrid>
-        <w:gridCol w:w="2448"/>
-        <w:gridCol w:w="2448"/>
-        <w:gridCol w:w="2448"/>
-        <w:gridCol w:w="2448"/>
-      </w:tblGrid>
-      <w:tr>
-        <w:tc>
-          <w:tcPr>
-            <w:tcW w:type="dxa" w:w="2592"/>
-            <w:shd w:fill="E8EEF5"/>
-            <w:tcBorders>
-              <w:top w:sz="4" w:val="single" w:color="BFBFBF"/>
-              <w:bottom w:sz="4" w:val="single" w:color="BFBFBF"/>
-              <w:left w:sz="4" w:val="single" w:color="BFBFBF"/>
-              <w:right w:sz="4" w:val="single" w:color="BFBFBF"/>
-            </w:tcBorders>
-            <w:vAlign w:val="center"/>
-            <w:tcMar>
-              <w:top w:w="80" w:type="dxa"/>
-              <w:start w:w="120" w:type="dxa"/>
-              <w:bottom w:w="80" w:type="dxa"/>
-              <w:end w:w="120" w:type="dxa"/>
-            </w:tcMar>
-          </w:tcPr>
-          <w:p>
-            <w:r>
-              <w:rPr>
-                <w:rFonts w:ascii="Calibri" w:hAnsi="Calibri"/>
-                <w:b/>
-                <w:color w:val="0B2545"/>
-                <w:sz w:val="18"/>
-              </w:rPr>
-              <w:t>Outil</w:t>
-            </w:r>
-          </w:p>
-        </w:tc>
-        <w:tc>
-          <w:tcPr>
-            <w:tcW w:type="dxa" w:w="3600"/>
-            <w:shd w:fill="E8EEF5"/>
-            <w:tcBorders>
-              <w:top w:sz="4" w:val="single" w:color="BFBFBF"/>
-              <w:bottom w:sz="4" w:val="single" w:color="BFBFBF"/>
-              <w:left w:sz="4" w:val="single" w:color="BFBFBF"/>
-              <w:right w:sz="4" w:val="single" w:color="BFBFBF"/>
-            </w:tcBorders>
-            <w:vAlign w:val="center"/>
-            <w:tcMar>
-              <w:top w:w="80" w:type="dxa"/>
-              <w:start w:w="120" w:type="dxa"/>
-              <w:bottom w:w="80" w:type="dxa"/>
-              <w:end w:w="120" w:type="dxa"/>
-            </w:tcMar>
-          </w:tcPr>
-          <w:p>
-            <w:r>
-              <w:rPr>
-                <w:rFonts w:ascii="Calibri" w:hAnsi="Calibri"/>
-                <w:b/>
-                <w:color w:val="0B2545"/>
-                <w:sz w:val="18"/>
-              </w:rPr>
-              <w:t>Description</w:t>
-            </w:r>
-          </w:p>
-        </w:tc>
-        <w:tc>
-          <w:tcPr>
-            <w:tcW w:type="dxa" w:w="1152"/>
-            <w:shd w:fill="E8EEF5"/>
-            <w:tcBorders>
-              <w:top w:sz="4" w:val="single" w:color="BFBFBF"/>
-              <w:bottom w:sz="4" w:val="single" w:color="BFBFBF"/>
-              <w:left w:sz="4" w:val="single" w:color="BFBFBF"/>
-              <w:right w:sz="4" w:val="single" w:color="BFBFBF"/>
-            </w:tcBorders>
-            <w:vAlign w:val="center"/>
-            <w:tcMar>
-              <w:top w:w="80" w:type="dxa"/>
-              <w:start w:w="120" w:type="dxa"/>
-              <w:bottom w:w="80" w:type="dxa"/>
-              <w:end w:w="120" w:type="dxa"/>
-            </w:tcMar>
-          </w:tcPr>
-          <w:p>
-            <w:r>
-              <w:rPr>
-                <w:rFonts w:ascii="Calibri" w:hAnsi="Calibri"/>
-                <w:b/>
-                <w:color w:val="0B2545"/>
-                <w:sz w:val="18"/>
-              </w:rPr>
-              <w:t>Pertinence TokenForge</w:t>
-            </w:r>
-          </w:p>
-        </w:tc>
-        <w:tc>
-          <w:tcPr>
-            <w:tcW w:type="dxa" w:w="1872"/>
-            <w:shd w:fill="E8EEF5"/>
-            <w:tcBorders>
-              <w:top w:sz="4" w:val="single" w:color="BFBFBF"/>
-              <w:bottom w:sz="4" w:val="single" w:color="BFBFBF"/>
-              <w:left w:sz="4" w:val="single" w:color="BFBFBF"/>
-              <w:right w:sz="4" w:val="single" w:color="BFBFBF"/>
-            </w:tcBorders>
-            <w:vAlign w:val="center"/>
-            <w:tcMar>
-              <w:top w:w="80" w:type="dxa"/>
-              <w:start w:w="120" w:type="dxa"/>
-              <w:bottom w:w="80" w:type="dxa"/>
-              <w:end w:w="120" w:type="dxa"/>
-            </w:tcMar>
-          </w:tcPr>
-          <w:p>
-            <w:r>
-              <w:rPr>
-                <w:rFonts w:ascii="Calibri" w:hAnsi="Calibri"/>
-                <w:b/>
-                <w:color w:val="0B2545"/>
-                <w:sz w:val="18"/>
-              </w:rPr>
-              <w:t>Lien</w:t>
-            </w:r>
-          </w:p>
-        </w:tc>
-      </w:tr>
-      <w:tr>
-        <w:tc>
-          <w:tcPr>
-            <w:tcW w:type="dxa" w:w="2592"/>
-            <w:shd w:fill="F2F4F7"/>
-            <w:tcBorders>
-              <w:top w:sz="4" w:val="single" w:color="BFBFBF"/>
-              <w:bottom w:sz="4" w:val="single" w:color="BFBFBF"/>
-              <w:left w:sz="4" w:val="single" w:color="BFBFBF"/>
-              <w:right w:sz="4" w:val="single" w:color="BFBFBF"/>
-            </w:tcBorders>
-            <w:vAlign w:val="center"/>
-            <w:tcMar>
-              <w:top w:w="80" w:type="dxa"/>
-              <w:start w:w="120" w:type="dxa"/>
-              <w:bottom w:w="80" w:type="dxa"/>
-              <w:end w:w="120" w:type="dxa"/>
-            </w:tcMar>
-          </w:tcPr>
-          <w:p>
-            <w:r>
-              <w:rPr>
-                <w:rFonts w:ascii="Calibri" w:hAnsi="Calibri"/>
-                <w:sz w:val="18"/>
-              </w:rPr>
-              <w:t>rtk-ai/rtk</w:t>
-            </w:r>
-          </w:p>
-        </w:tc>
-        <w:tc>
-          <w:tcPr>
-            <w:tcW w:type="dxa" w:w="3600"/>
-            <w:shd w:fill="F2F4F7"/>
-            <w:tcBorders>
-              <w:top w:sz="4" w:val="single" w:color="BFBFBF"/>
-              <w:bottom w:sz="4" w:val="single" w:color="BFBFBF"/>
-              <w:left w:sz="4" w:val="single" w:color="BFBFBF"/>
-              <w:right w:sz="4" w:val="single" w:color="BFBFBF"/>
-            </w:tcBorders>
-            <w:vAlign w:val="center"/>
-            <w:tcMar>
-              <w:top w:w="80" w:type="dxa"/>
-              <w:start w:w="120" w:type="dxa"/>
-              <w:bottom w:w="80" w:type="dxa"/>
-              <w:end w:w="120" w:type="dxa"/>
-            </w:tcMar>
-          </w:tcPr>
-          <w:p>
-            <w:r>
-              <w:rPr>
-                <w:rFonts w:ascii="Calibri" w:hAnsi="Calibri"/>
-                <w:sz w:val="18"/>
-              </w:rPr>
-              <w:t>Run RTK from Command Prompt, PowerShell, or Windows Terminal — do not double-click the .exe (it will flash and close). The full hook system works nati</w:t>
-            </w:r>
-          </w:p>
-        </w:tc>
-        <w:tc>
-          <w:tcPr>
-            <w:tcW w:type="dxa" w:w="1152"/>
-            <w:shd w:fill="F2F4F7"/>
-            <w:tcBorders>
-              <w:top w:sz="4" w:val="single" w:color="BFBFBF"/>
-              <w:bottom w:sz="4" w:val="single" w:color="BFBFBF"/>
-              <w:left w:sz="4" w:val="single" w:color="BFBFBF"/>
-              <w:right w:sz="4" w:val="single" w:color="BFBFBF"/>
-            </w:tcBorders>
-            <w:vAlign w:val="center"/>
-            <w:tcMar>
-              <w:top w:w="80" w:type="dxa"/>
-              <w:start w:w="120" w:type="dxa"/>
-              <w:bottom w:w="80" w:type="dxa"/>
-              <w:end w:w="120" w:type="dxa"/>
-            </w:tcMar>
-          </w:tcPr>
-          <w:p>
-            <w:r>
-              <w:rPr>
-                <w:rFonts w:ascii="Calibri" w:hAnsi="Calibri"/>
-                <w:sz w:val="18"/>
-              </w:rPr>
-              <w:t>8.2/10</w:t>
-            </w:r>
-          </w:p>
-        </w:tc>
-        <w:tc>
-          <w:tcPr>
-            <w:tcW w:type="dxa" w:w="1872"/>
-            <w:shd w:fill="F2F4F7"/>
-            <w:tcBorders>
-              <w:top w:sz="4" w:val="single" w:color="BFBFBF"/>
-              <w:bottom w:sz="4" w:val="single" w:color="BFBFBF"/>
-              <w:left w:sz="4" w:val="single" w:color="BFBFBF"/>
-              <w:right w:sz="4" w:val="single" w:color="BFBFBF"/>
-            </w:tcBorders>
-            <w:vAlign w:val="center"/>
-            <w:tcMar>
-              <w:top w:w="80" w:type="dxa"/>
-              <w:start w:w="120" w:type="dxa"/>
-              <w:bottom w:w="80" w:type="dxa"/>
-              <w:end w:w="120" w:type="dxa"/>
-            </w:tcMar>
-          </w:tcPr>
-          <w:p>
-            <w:r>
-              <w:rPr>
-                <w:rFonts w:ascii="Calibri" w:hAnsi="Calibri"/>
-                <w:sz w:val="18"/>
-              </w:rPr>
-              <w:t>https://github.com/rtk-ai/rtk</w:t>
-            </w:r>
-          </w:p>
-        </w:tc>
-      </w:tr>
-      <w:tr>
-        <w:tc>
-          <w:tcPr>
-            <w:tcW w:type="dxa" w:w="2592"/>
-            <w:tcBorders>
-              <w:top w:sz="4" w:val="single" w:color="BFBFBF"/>
-              <w:bottom w:sz="4" w:val="single" w:color="BFBFBF"/>
-              <w:left w:sz="4" w:val="single" w:color="BFBFBF"/>
-              <w:right w:sz="4" w:val="single" w:color="BFBFBF"/>
-            </w:tcBorders>
-            <w:vAlign w:val="center"/>
-            <w:tcMar>
-              <w:top w:w="80" w:type="dxa"/>
-              <w:start w:w="120" w:type="dxa"/>
-              <w:bottom w:w="80" w:type="dxa"/>
-              <w:end w:w="120" w:type="dxa"/>
-            </w:tcMar>
-          </w:tcPr>
-          <w:p>
-            <w:r>
-              <w:rPr>
-                <w:rFonts w:ascii="Calibri" w:hAnsi="Calibri"/>
-                <w:sz w:val="18"/>
-              </w:rPr>
-              <w:t>Releases · rtk-ai/rtk - GitHub</w:t>
-            </w:r>
-          </w:p>
-        </w:tc>
-        <w:tc>
-          <w:tcPr>
-            <w:tcW w:type="dxa" w:w="3600"/>
-            <w:tcBorders>
-              <w:top w:sz="4" w:val="single" w:color="BFBFBF"/>
-              <w:bottom w:sz="4" w:val="single" w:color="BFBFBF"/>
-              <w:left w:sz="4" w:val="single" w:color="BFBFBF"/>
-              <w:right w:sz="4" w:val="single" w:color="BFBFBF"/>
-            </w:tcBorders>
-            <w:vAlign w:val="center"/>
-            <w:tcMar>
-              <w:top w:w="80" w:type="dxa"/>
-              <w:start w:w="120" w:type="dxa"/>
-              <w:bottom w:w="80" w:type="dxa"/>
-              <w:end w:w="120" w:type="dxa"/>
-            </w:tcMar>
-          </w:tcPr>
-          <w:p>
-            <w:r>
-              <w:rPr>
-                <w:rFonts w:ascii="Calibri" w:hAnsi="Calibri"/>
-                <w:sz w:val="18"/>
-              </w:rPr>
-              <w:t>CLI proxy that reduces LLM token consumption by 60-90% on common dev commands. Single Rust binary, zero dependencies - Releases · rtk-ai/rtk</w:t>
-            </w:r>
-          </w:p>
-        </w:tc>
-        <w:tc>
-          <w:tcPr>
-            <w:tcW w:type="dxa" w:w="1152"/>
-            <w:tcBorders>
-              <w:top w:sz="4" w:val="single" w:color="BFBFBF"/>
-              <w:bottom w:sz="4" w:val="single" w:color="BFBFBF"/>
-              <w:left w:sz="4" w:val="single" w:color="BFBFBF"/>
-              <w:right w:sz="4" w:val="single" w:color="BFBFBF"/>
-            </w:tcBorders>
-            <w:vAlign w:val="center"/>
-            <w:tcMar>
-              <w:top w:w="80" w:type="dxa"/>
-              <w:start w:w="120" w:type="dxa"/>
-              <w:bottom w:w="80" w:type="dxa"/>
-              <w:end w:w="120" w:type="dxa"/>
-            </w:tcMar>
-          </w:tcPr>
-          <w:p>
-            <w:r>
-              <w:rPr>
-                <w:rFonts w:ascii="Calibri" w:hAnsi="Calibri"/>
-                <w:sz w:val="18"/>
-              </w:rPr>
-              <w:t>7.6/10</w:t>
-            </w:r>
-          </w:p>
-        </w:tc>
-        <w:tc>
-          <w:tcPr>
-            <w:tcW w:type="dxa" w:w="1872"/>
-            <w:tcBorders>
-              <w:top w:sz="4" w:val="single" w:color="BFBFBF"/>
-              <w:bottom w:sz="4" w:val="single" w:color="BFBFBF"/>
-              <w:left w:sz="4" w:val="single" w:color="BFBFBF"/>
-              <w:right w:sz="4" w:val="single" w:color="BFBFBF"/>
-            </w:tcBorders>
-            <w:vAlign w:val="center"/>
-            <w:tcMar>
-              <w:top w:w="80" w:type="dxa"/>
-              <w:start w:w="120" w:type="dxa"/>
-              <w:bottom w:w="80" w:type="dxa"/>
-              <w:end w:w="120" w:type="dxa"/>
-            </w:tcMar>
-          </w:tcPr>
-          <w:p>
-            <w:r>
-              <w:rPr>
-                <w:rFonts w:ascii="Calibri" w:hAnsi="Calibri"/>
-                <w:sz w:val="18"/>
-              </w:rPr>
-              <w:t>https://github.com/rtk-ai/rtk/releases</w:t>
-            </w:r>
-          </w:p>
-        </w:tc>
-      </w:tr>
-      <w:tr>
-        <w:tc>
-          <w:tcPr>
-            <w:tcW w:type="dxa" w:w="2592"/>
-            <w:shd w:fill="F2F4F7"/>
-            <w:tcBorders>
-              <w:top w:sz="4" w:val="single" w:color="BFBFBF"/>
-              <w:bottom w:sz="4" w:val="single" w:color="BFBFBF"/>
-              <w:left w:sz="4" w:val="single" w:color="BFBFBF"/>
-              <w:right w:sz="4" w:val="single" w:color="BFBFBF"/>
-            </w:tcBorders>
-            <w:vAlign w:val="center"/>
-            <w:tcMar>
-              <w:top w:w="80" w:type="dxa"/>
-              <w:start w:w="120" w:type="dxa"/>
-              <w:bottom w:w="80" w:type="dxa"/>
-              <w:end w:w="120" w:type="dxa"/>
-            </w:tcMar>
-          </w:tcPr>
-          <w:p>
-            <w:r>
-              <w:rPr>
-                <w:rFonts w:ascii="Calibri" w:hAnsi="Calibri"/>
-                <w:sz w:val="18"/>
-              </w:rPr>
-              <w:t>RTK — Rust Token Killer</w:t>
-            </w:r>
-          </w:p>
-        </w:tc>
-        <w:tc>
-          <w:tcPr>
-            <w:tcW w:type="dxa" w:w="3600"/>
-            <w:shd w:fill="F2F4F7"/>
-            <w:tcBorders>
-              <w:top w:sz="4" w:val="single" w:color="BFBFBF"/>
-              <w:bottom w:sz="4" w:val="single" w:color="BFBFBF"/>
-              <w:left w:sz="4" w:val="single" w:color="BFBFBF"/>
-              <w:right w:sz="4" w:val="single" w:color="BFBFBF"/>
-            </w:tcBorders>
-            <w:vAlign w:val="center"/>
-            <w:tcMar>
-              <w:top w:w="80" w:type="dxa"/>
-              <w:start w:w="120" w:type="dxa"/>
-              <w:bottom w:w="80" w:type="dxa"/>
-              <w:end w:w="120" w:type="dxa"/>
-            </w:tcMar>
-          </w:tcPr>
-          <w:p>
-            <w:r>
-              <w:rPr>
-                <w:rFonts w:ascii="Calibri" w:hAnsi="Calibri"/>
-                <w:sz w:val="18"/>
-              </w:rPr>
-              <w:t>RTK is an open-source CLI tool that compresses command outputs before they reach the AI context window. It reduces token usage by 60-90% with zero con</w:t>
-            </w:r>
-          </w:p>
-        </w:tc>
-        <w:tc>
-          <w:tcPr>
-            <w:tcW w:type="dxa" w:w="1152"/>
-            <w:shd w:fill="F2F4F7"/>
-            <w:tcBorders>
-              <w:top w:sz="4" w:val="single" w:color="BFBFBF"/>
-              <w:bottom w:sz="4" w:val="single" w:color="BFBFBF"/>
-              <w:left w:sz="4" w:val="single" w:color="BFBFBF"/>
-              <w:right w:sz="4" w:val="single" w:color="BFBFBF"/>
-            </w:tcBorders>
-            <w:vAlign w:val="center"/>
-            <w:tcMar>
-              <w:top w:w="80" w:type="dxa"/>
-              <w:start w:w="120" w:type="dxa"/>
-              <w:bottom w:w="80" w:type="dxa"/>
-              <w:end w:w="120" w:type="dxa"/>
-            </w:tcMar>
-          </w:tcPr>
-          <w:p>
-            <w:r>
-              <w:rPr>
-                <w:rFonts w:ascii="Calibri" w:hAnsi="Calibri"/>
-                <w:sz w:val="18"/>
-              </w:rPr>
-              <w:t>6.5/10</w:t>
-            </w:r>
-          </w:p>
-        </w:tc>
-        <w:tc>
-          <w:tcPr>
-            <w:tcW w:type="dxa" w:w="1872"/>
-            <w:shd w:fill="F2F4F7"/>
-            <w:tcBorders>
-              <w:top w:sz="4" w:val="single" w:color="BFBFBF"/>
-              <w:bottom w:sz="4" w:val="single" w:color="BFBFBF"/>
-              <w:left w:sz="4" w:val="single" w:color="BFBFBF"/>
-              <w:right w:sz="4" w:val="single" w:color="BFBFBF"/>
-            </w:tcBorders>
-            <w:vAlign w:val="center"/>
-            <w:tcMar>
-              <w:top w:w="80" w:type="dxa"/>
-              <w:start w:w="120" w:type="dxa"/>
-              <w:bottom w:w="80" w:type="dxa"/>
-              <w:end w:w="120" w:type="dxa"/>
-            </w:tcMar>
-          </w:tcPr>
-          <w:p>
-            <w:r>
-              <w:rPr>
-                <w:rFonts w:ascii="Calibri" w:hAnsi="Calibri"/>
-                <w:sz w:val="18"/>
-              </w:rPr>
-              <w:t>https://www.rtk-ai.app/</w:t>
-            </w:r>
-          </w:p>
-        </w:tc>
-      </w:tr>
-      <w:tr>
-        <w:tc>
-          <w:tcPr>
-            <w:tcW w:type="dxa" w:w="2592"/>
-            <w:tcBorders>
-              <w:top w:sz="4" w:val="single" w:color="BFBFBF"/>
-              <w:bottom w:sz="4" w:val="single" w:color="BFBFBF"/>
-              <w:left w:sz="4" w:val="single" w:color="BFBFBF"/>
-              <w:right w:sz="4" w:val="single" w:color="BFBFBF"/>
-            </w:tcBorders>
-            <w:vAlign w:val="center"/>
-            <w:tcMar>
-              <w:top w:w="80" w:type="dxa"/>
-              <w:start w:w="120" w:type="dxa"/>
-              <w:bottom w:w="80" w:type="dxa"/>
-              <w:end w:w="120" w:type="dxa"/>
-            </w:tcMar>
-          </w:tcPr>
-          <w:p>
-            <w:r>
-              <w:rPr>
-                <w:rFonts w:ascii="Calibri" w:hAnsi="Calibri"/>
-                <w:sz w:val="18"/>
-              </w:rPr>
-              <w:t>Que veut dire Token ? Le guide complet pour comprendre les u</w:t>
-            </w:r>
-          </w:p>
-        </w:tc>
-        <w:tc>
-          <w:tcPr>
-            <w:tcW w:type="dxa" w:w="3600"/>
-            <w:tcBorders>
-              <w:top w:sz="4" w:val="single" w:color="BFBFBF"/>
-              <w:bottom w:sz="4" w:val="single" w:color="BFBFBF"/>
-              <w:left w:sz="4" w:val="single" w:color="BFBFBF"/>
-              <w:right w:sz="4" w:val="single" w:color="BFBFBF"/>
-            </w:tcBorders>
-            <w:vAlign w:val="center"/>
-            <w:tcMar>
-              <w:top w:w="80" w:type="dxa"/>
-              <w:start w:w="120" w:type="dxa"/>
-              <w:bottom w:w="80" w:type="dxa"/>
-              <w:end w:w="120" w:type="dxa"/>
-            </w:tcMar>
-          </w:tcPr>
-          <w:p>
-            <w:r>
-              <w:rPr>
-                <w:rFonts w:ascii="Calibri" w:hAnsi="Calibri"/>
-                <w:sz w:val="18"/>
-              </w:rPr>
-              <w:t>On parlera de token informatique lorsqu’il s’agit de mots de passe, de clés ou de jetons authentifiants. Dans le domaine de la cryptographie et des cr</w:t>
-            </w:r>
-          </w:p>
-        </w:tc>
-        <w:tc>
-          <w:tcPr>
-            <w:tcW w:type="dxa" w:w="1152"/>
-            <w:tcBorders>
-              <w:top w:sz="4" w:val="single" w:color="BFBFBF"/>
-              <w:bottom w:sz="4" w:val="single" w:color="BFBFBF"/>
-              <w:left w:sz="4" w:val="single" w:color="BFBFBF"/>
-              <w:right w:sz="4" w:val="single" w:color="BFBFBF"/>
-            </w:tcBorders>
-            <w:vAlign w:val="center"/>
-            <w:tcMar>
-              <w:top w:w="80" w:type="dxa"/>
-              <w:start w:w="120" w:type="dxa"/>
-              <w:bottom w:w="80" w:type="dxa"/>
-              <w:end w:w="120" w:type="dxa"/>
-            </w:tcMar>
-          </w:tcPr>
-          <w:p>
-            <w:r>
-              <w:rPr>
-                <w:rFonts w:ascii="Calibri" w:hAnsi="Calibri"/>
-                <w:sz w:val="18"/>
-              </w:rPr>
-              <w:t>5.2/10</w:t>
-            </w:r>
-          </w:p>
-        </w:tc>
-        <w:tc>
-          <w:tcPr>
-            <w:tcW w:type="dxa" w:w="1872"/>
-            <w:tcBorders>
-              <w:top w:sz="4" w:val="single" w:color="BFBFBF"/>
-              <w:bottom w:sz="4" w:val="single" w:color="BFBFBF"/>
-              <w:left w:sz="4" w:val="single" w:color="BFBFBF"/>
-              <w:right w:sz="4" w:val="single" w:color="BFBFBF"/>
-            </w:tcBorders>
-            <w:vAlign w:val="center"/>
-            <w:tcMar>
-              <w:top w:w="80" w:type="dxa"/>
-              <w:start w:w="120" w:type="dxa"/>
-              <w:bottom w:w="80" w:type="dxa"/>
-              <w:end w:w="120" w:type="dxa"/>
-            </w:tcMar>
-          </w:tcPr>
-          <w:p>
-            <w:r>
-              <w:rPr>
-                <w:rFonts w:ascii="Calibri" w:hAnsi="Calibri"/>
-                <w:sz w:val="18"/>
-              </w:rPr>
-              <w:t>https://kablo.fr/que-veut-dire-token/</w:t>
-            </w:r>
-          </w:p>
-        </w:tc>
-      </w:tr>
-      <w:tr>
-        <w:tc>
-          <w:tcPr>
-            <w:tcW w:type="dxa" w:w="2592"/>
-            <w:shd w:fill="F2F4F7"/>
-            <w:tcBorders>
-              <w:top w:sz="4" w:val="single" w:color="BFBFBF"/>
-              <w:bottom w:sz="4" w:val="single" w:color="BFBFBF"/>
-              <w:left w:sz="4" w:val="single" w:color="BFBFBF"/>
-              <w:right w:sz="4" w:val="single" w:color="BFBFBF"/>
-            </w:tcBorders>
-            <w:vAlign w:val="center"/>
-            <w:tcMar>
-              <w:top w:w="80" w:type="dxa"/>
-              <w:start w:w="120" w:type="dxa"/>
-              <w:bottom w:w="80" w:type="dxa"/>
-              <w:end w:w="120" w:type="dxa"/>
-            </w:tcMar>
-          </w:tcPr>
-          <w:p>
-            <w:r>
-              <w:rPr>
-                <w:rFonts w:ascii="Calibri" w:hAnsi="Calibri"/>
-                <w:sz w:val="18"/>
-              </w:rPr>
-              <w:t>Releases · BerriAI/litellm - GitHub</w:t>
-            </w:r>
-          </w:p>
-        </w:tc>
-        <w:tc>
-          <w:tcPr>
-            <w:tcW w:type="dxa" w:w="3600"/>
-            <w:shd w:fill="F2F4F7"/>
-            <w:tcBorders>
-              <w:top w:sz="4" w:val="single" w:color="BFBFBF"/>
-              <w:bottom w:sz="4" w:val="single" w:color="BFBFBF"/>
-              <w:left w:sz="4" w:val="single" w:color="BFBFBF"/>
-              <w:right w:sz="4" w:val="single" w:color="BFBFBF"/>
-            </w:tcBorders>
-            <w:vAlign w:val="center"/>
-            <w:tcMar>
-              <w:top w:w="80" w:type="dxa"/>
-              <w:start w:w="120" w:type="dxa"/>
-              <w:bottom w:w="80" w:type="dxa"/>
-              <w:end w:w="120" w:type="dxa"/>
-            </w:tcMar>
-          </w:tcPr>
-          <w:p>
-            <w:r>
-              <w:rPr>
-                <w:rFonts w:ascii="Calibri" w:hAnsi="Calibri"/>
-                <w:sz w:val="18"/>
-              </w:rPr>
-              <w:t>The fastest, litest AI Gateway. Rust core with Python SDK. Call 100+ LLM APIs in OpenAI (or native) format with cost tracking, guardrails, load balanc</w:t>
-            </w:r>
-          </w:p>
-        </w:tc>
-        <w:tc>
-          <w:tcPr>
-            <w:tcW w:type="dxa" w:w="1152"/>
-            <w:shd w:fill="F2F4F7"/>
-            <w:tcBorders>
-              <w:top w:sz="4" w:val="single" w:color="BFBFBF"/>
-              <w:bottom w:sz="4" w:val="single" w:color="BFBFBF"/>
-              <w:left w:sz="4" w:val="single" w:color="BFBFBF"/>
-              <w:right w:sz="4" w:val="single" w:color="BFBFBF"/>
-            </w:tcBorders>
-            <w:vAlign w:val="center"/>
-            <w:tcMar>
-              <w:top w:w="80" w:type="dxa"/>
-              <w:start w:w="120" w:type="dxa"/>
-              <w:bottom w:w="80" w:type="dxa"/>
-              <w:end w:w="120" w:type="dxa"/>
-            </w:tcMar>
-          </w:tcPr>
-          <w:p>
-            <w:r>
-              <w:rPr>
-                <w:rFonts w:ascii="Calibri" w:hAnsi="Calibri"/>
-                <w:sz w:val="18"/>
-              </w:rPr>
-              <w:t>5.2/10</w:t>
-            </w:r>
-          </w:p>
-        </w:tc>
-        <w:tc>
-          <w:tcPr>
-            <w:tcW w:type="dxa" w:w="1872"/>
-            <w:shd w:fill="F2F4F7"/>
-            <w:tcBorders>
-              <w:top w:sz="4" w:val="single" w:color="BFBFBF"/>
-              <w:bottom w:sz="4" w:val="single" w:color="BFBFBF"/>
-              <w:left w:sz="4" w:val="single" w:color="BFBFBF"/>
-              <w:right w:sz="4" w:val="single" w:color="BFBFBF"/>
-            </w:tcBorders>
-            <w:vAlign w:val="center"/>
-            <w:tcMar>
-              <w:top w:w="80" w:type="dxa"/>
-              <w:start w:w="120" w:type="dxa"/>
-              <w:bottom w:w="80" w:type="dxa"/>
-              <w:end w:w="120" w:type="dxa"/>
-            </w:tcMar>
-          </w:tcPr>
-          <w:p>
-            <w:r>
-              <w:rPr>
-                <w:rFonts w:ascii="Calibri" w:hAnsi="Calibri"/>
-                <w:sz w:val="18"/>
-              </w:rPr>
-              <w:t>https://github.com/BerriAI/litellm/releases</w:t>
-            </w:r>
-          </w:p>
-        </w:tc>
-      </w:tr>
-      <w:tr>
-        <w:tc>
-          <w:tcPr>
-            <w:tcW w:type="dxa" w:w="2592"/>
-            <w:tcBorders>
-              <w:top w:sz="4" w:val="single" w:color="BFBFBF"/>
-              <w:bottom w:sz="4" w:val="single" w:color="BFBFBF"/>
-              <w:left w:sz="4" w:val="single" w:color="BFBFBF"/>
-              <w:right w:sz="4" w:val="single" w:color="BFBFBF"/>
-            </w:tcBorders>
-            <w:vAlign w:val="center"/>
-            <w:tcMar>
-              <w:top w:w="80" w:type="dxa"/>
-              <w:start w:w="120" w:type="dxa"/>
-              <w:bottom w:w="80" w:type="dxa"/>
-              <w:end w:w="120" w:type="dxa"/>
-            </w:tcMar>
-          </w:tcPr>
-          <w:p>
-            <w:r>
-              <w:rPr>
-                <w:rFonts w:ascii="Calibri" w:hAnsi="Calibri"/>
-                <w:sz w:val="18"/>
-              </w:rPr>
-              <w:t>Token</w:t>
-            </w:r>
-          </w:p>
-        </w:tc>
-        <w:tc>
-          <w:tcPr>
-            <w:tcW w:type="dxa" w:w="3600"/>
-            <w:tcBorders>
-              <w:top w:sz="4" w:val="single" w:color="BFBFBF"/>
-              <w:bottom w:sz="4" w:val="single" w:color="BFBFBF"/>
-              <w:left w:sz="4" w:val="single" w:color="BFBFBF"/>
-              <w:right w:sz="4" w:val="single" w:color="BFBFBF"/>
-            </w:tcBorders>
-            <w:vAlign w:val="center"/>
-            <w:tcMar>
-              <w:top w:w="80" w:type="dxa"/>
-              <w:start w:w="120" w:type="dxa"/>
-              <w:bottom w:w="80" w:type="dxa"/>
-              <w:end w:w="120" w:type="dxa"/>
-            </w:tcMar>
-          </w:tcPr>
-          <w:p>
-            <w:r>
-              <w:rPr>
-                <w:rFonts w:ascii="Calibri" w:hAnsi="Calibri"/>
-                <w:sz w:val="18"/>
-              </w:rPr>
-              <w:t>Un token est un actif numérique qui facilite les échanges sur une blockchain. Il peut permettre d’acquérir un produit ou des produits financiers.</w:t>
-            </w:r>
-          </w:p>
-        </w:tc>
-        <w:tc>
-          <w:tcPr>
-            <w:tcW w:type="dxa" w:w="1152"/>
-            <w:tcBorders>
-              <w:top w:sz="4" w:val="single" w:color="BFBFBF"/>
-              <w:bottom w:sz="4" w:val="single" w:color="BFBFBF"/>
-              <w:left w:sz="4" w:val="single" w:color="BFBFBF"/>
-              <w:right w:sz="4" w:val="single" w:color="BFBFBF"/>
-            </w:tcBorders>
-            <w:vAlign w:val="center"/>
-            <w:tcMar>
-              <w:top w:w="80" w:type="dxa"/>
-              <w:start w:w="120" w:type="dxa"/>
-              <w:bottom w:w="80" w:type="dxa"/>
-              <w:end w:w="120" w:type="dxa"/>
-            </w:tcMar>
-          </w:tcPr>
-          <w:p>
-            <w:r>
-              <w:rPr>
-                <w:rFonts w:ascii="Calibri" w:hAnsi="Calibri"/>
-                <w:sz w:val="18"/>
-              </w:rPr>
-              <w:t>4.8/10</w:t>
-            </w:r>
-          </w:p>
-        </w:tc>
-        <w:tc>
-          <w:tcPr>
-            <w:tcW w:type="dxa" w:w="1872"/>
-            <w:tcBorders>
-              <w:top w:sz="4" w:val="single" w:color="BFBFBF"/>
-              <w:bottom w:sz="4" w:val="single" w:color="BFBFBF"/>
-              <w:left w:sz="4" w:val="single" w:color="BFBFBF"/>
-              <w:right w:sz="4" w:val="single" w:color="BFBFBF"/>
-            </w:tcBorders>
-            <w:vAlign w:val="center"/>
-            <w:tcMar>
-              <w:top w:w="80" w:type="dxa"/>
-              <w:start w:w="120" w:type="dxa"/>
-              <w:bottom w:w="80" w:type="dxa"/>
-              <w:end w:w="120" w:type="dxa"/>
-            </w:tcMar>
-          </w:tcPr>
-          <w:p>
-            <w:r>
-              <w:rPr>
-                <w:rFonts w:ascii="Calibri" w:hAnsi="Calibri"/>
-                <w:sz w:val="18"/>
-              </w:rPr>
-              <w:t>https://blockchainfrance.net/decouvrir-la-blockchain/comprendre-les-tokens/</w:t>
-            </w:r>
-          </w:p>
-        </w:tc>
-      </w:tr>
-    </w:tbl>
     <w:p>
       <w:pPr>
         <w:spacing w:after="40" w:line="264" w:lineRule="auto"/>
@@ -2635,11 +1820,19 @@
           <w:rFonts w:ascii="Calibri" w:hAnsi="Calibri"/>
           <w:b/>
           <w:color w:val="0B2545"/>
+          <w:sz w:val="20"/>
+        </w:rPr>
+        <w:t xml:space="preserve">rtk-ai/rtk </w:t>
+      </w:r>
+      <w:r>
+        <w:rPr>
+          <w:rFonts w:ascii="Calibri" w:hAnsi="Calibri"/>
+          <w:color w:val="565F6C"/>
           <w:sz w:val="18"/>
         </w:rPr>
-        <w:t xml:space="preserve">rtk-ai/rtk : </w:t>
+        <w:t xml:space="preserve">Run RTK from Command Prompt, PowerShell, or Windows Terminal - do not double-click the .exe (it will flash and close). </w:t>
       </w:r>
-      <w:hyperlink r:id="rId22">
+      <w:hyperlink r:id="rId27">
         <w:r>
           <w:rPr>
             <w:color w:val="0563C1"/>
@@ -2658,34 +1851,19 @@
           <w:rFonts w:ascii="Calibri" w:hAnsi="Calibri"/>
           <w:b/>
           <w:color w:val="0B2545"/>
-          <w:sz w:val="18"/>
+          <w:sz w:val="20"/>
         </w:rPr>
-        <w:t xml:space="preserve">Releases · rtk-ai/rtk - GitHub : </w:t>
+        <w:t xml:space="preserve">RTK - Rust Token Killer </w:t>
       </w:r>
-      <w:hyperlink r:id="rId23">
-        <w:r>
-          <w:rPr>
-            <w:color w:val="0563C1"/>
-            <w:u w:val="single"/>
-          </w:rPr>
-          <w:t>https://github.com/rtk-ai/rtk/releases</w:t>
-        </w:r>
-      </w:hyperlink>
-    </w:p>
-    <w:p>
-      <w:pPr>
-        <w:spacing w:after="40" w:line="264" w:lineRule="auto"/>
-      </w:pPr>
       <w:r>
         <w:rPr>
           <w:rFonts w:ascii="Calibri" w:hAnsi="Calibri"/>
-          <w:b/>
-          <w:color w:val="0B2545"/>
+          <w:color w:val="565F6C"/>
           <w:sz w:val="18"/>
         </w:rPr>
-        <w:t xml:space="preserve">RTK — Rust Token Killer : </w:t>
+        <w:t xml:space="preserve">RTK is an open-source CLI tool that compresses command outputs before they reach the AI context window. </w:t>
       </w:r>
-      <w:hyperlink r:id="rId24">
+      <w:hyperlink r:id="rId28">
         <w:r>
           <w:rPr>
             <w:color w:val="0563C1"/>
@@ -2704,34 +1882,19 @@
           <w:rFonts w:ascii="Calibri" w:hAnsi="Calibri"/>
           <w:b/>
           <w:color w:val="0B2545"/>
-          <w:sz w:val="18"/>
+          <w:sz w:val="20"/>
         </w:rPr>
-        <w:t xml:space="preserve">Que veut dire Token ? Le guide complet pour comprendre les u : </w:t>
+        <w:t xml:space="preserve">Releases · BerriAI/litellm - GitHub </w:t>
       </w:r>
-      <w:hyperlink r:id="rId25">
-        <w:r>
-          <w:rPr>
-            <w:color w:val="0563C1"/>
-            <w:u w:val="single"/>
-          </w:rPr>
-          <w:t>https://kablo.fr/que-veut-dire-token/</w:t>
-        </w:r>
-      </w:hyperlink>
-    </w:p>
-    <w:p>
-      <w:pPr>
-        <w:spacing w:after="40" w:line="264" w:lineRule="auto"/>
-      </w:pPr>
       <w:r>
         <w:rPr>
           <w:rFonts w:ascii="Calibri" w:hAnsi="Calibri"/>
-          <w:b/>
-          <w:color w:val="0B2545"/>
+          <w:color w:val="565F6C"/>
           <w:sz w:val="18"/>
         </w:rPr>
-        <w:t xml:space="preserve">Releases · BerriAI/litellm - GitHub : </w:t>
+        <w:t xml:space="preserve">The fastest, litest AI Gateway. </w:t>
       </w:r>
-      <w:hyperlink r:id="rId26">
+      <w:hyperlink r:id="rId29">
         <w:r>
           <w:rPr>
             <w:color w:val="0563C1"/>
@@ -2750,17 +1913,87 @@
           <w:rFonts w:ascii="Calibri" w:hAnsi="Calibri"/>
           <w:b/>
           <w:color w:val="0B2545"/>
+          <w:sz w:val="20"/>
+        </w:rPr>
+        <w:t xml:space="preserve">Une revue détaillée de LitellM </w:t>
+      </w:r>
+      <w:r>
+        <w:rPr>
+          <w:rFonts w:ascii="Calibri" w:hAnsi="Calibri"/>
+          <w:color w:val="565F6C"/>
           <w:sz w:val="18"/>
         </w:rPr>
-        <w:t xml:space="preserve">Token : </w:t>
+        <w:t xml:space="preserve">LitellM est devenu la norme open source par défaut pour les équipes qui tentent de normaliser le paysage fragmenté des API LLM. </w:t>
       </w:r>
-      <w:hyperlink r:id="rId27">
+      <w:hyperlink r:id="rId30">
         <w:r>
           <w:rPr>
             <w:color w:val="0563C1"/>
             <w:u w:val="single"/>
           </w:rPr>
-          <w:t>https://blockchainfrance.net/decouvrir-la-blockchain/comprendre-les-tokens/</w:t>
+          <w:t>https://www.truefoundry.com/fr/blog/a-detailed-litellm-review-features-pricing-pros-and-cons-2026</w:t>
+        </w:r>
+      </w:hyperlink>
+    </w:p>
+    <w:p>
+      <w:pPr>
+        <w:spacing w:after="40" w:line="264" w:lineRule="auto"/>
+      </w:pPr>
+      <w:r>
+        <w:rPr>
+          <w:rFonts w:ascii="Calibri" w:hAnsi="Calibri"/>
+          <w:b/>
+          <w:color w:val="0B2545"/>
+          <w:sz w:val="20"/>
+        </w:rPr>
+        <w:t xml:space="preserve">LiteLLM - Open-Source AI Gateway &amp; LLM Proxy </w:t>
+      </w:r>
+      <w:r>
+        <w:rPr>
+          <w:rFonts w:ascii="Calibri" w:hAnsi="Calibri"/>
+          <w:color w:val="565F6C"/>
+          <w:sz w:val="18"/>
+        </w:rPr>
+        <w:t xml:space="preserve">LiteLLM gives NVIDIA engineers a single, consistent way to access more than 100 AI model endpoints across cloud providers, open source deployments, and internal NVIDIA services.. </w:t>
+      </w:r>
+      <w:hyperlink r:id="rId31">
+        <w:r>
+          <w:rPr>
+            <w:color w:val="0563C1"/>
+            <w:u w:val="single"/>
+          </w:rPr>
+          <w:t>https://www.litellm.ai/</w:t>
+        </w:r>
+      </w:hyperlink>
+    </w:p>
+    <w:p>
+      <w:pPr>
+        <w:spacing w:after="40" w:line="264" w:lineRule="auto"/>
+      </w:pPr>
+      <w:r>
+        <w:rPr>
+          <w:rFonts w:ascii="Calibri" w:hAnsi="Calibri"/>
+          <w:b/>
+          <w:color w:val="0B2545"/>
+          <w:sz w:val="20"/>
+        </w:rPr>
+        <w:t xml:space="preserve">Compare AI Models </w:t>
+      </w:r>
+      <w:r>
+        <w:rPr>
+          <w:rFonts w:ascii="Calibri" w:hAnsi="Calibri"/>
+          <w:color w:val="565F6C"/>
+          <w:sz w:val="18"/>
+        </w:rPr>
+        <w:t xml:space="preserve">Compare 400+ LLMs from OpenAI, Anthropic, Google, Meta and more - pricing, context length, and benchmarks side by side, all through one API.. </w:t>
+      </w:r>
+      <w:hyperlink r:id="rId32">
+        <w:r>
+          <w:rPr>
+            <w:color w:val="0563C1"/>
+            <w:u w:val="single"/>
+          </w:rPr>
+          <w:t>https://openrouter.ai/models</w:t>
         </w:r>
       </w:hyperlink>
     </w:p>
@@ -2778,7 +2011,7 @@
           <w:color w:val="0B2545"/>
           <w:sz w:val="25"/>
         </w:rPr>
-        <w:t>C. Analyse et actions pour TokenForge</w:t>
+        <w:t>C. Ce que j'en retiens pour TokenForge</w:t>
       </w:r>
     </w:p>
     <w:p>
@@ -2791,7 +2024,7 @@
           <w:rFonts w:ascii="Calibri" w:hAnsi="Calibri"/>
           <w:sz w:val="21"/>
         </w:rPr>
-        <w:t>4 outil(s) de routage/commutation identifie(s) - regarder si un(e) peut etre integree dans TokenForge pour basculer sur le provider le moins cher en temps reel.</w:t>
+        <w:t>5 outil(s) de routage entre fournisseurs identifie(s) - a regarder pour basculer sur le provider le moins cher en temps reel.</w:t>
       </w:r>
     </w:p>
     <w:p>
@@ -2804,7 +2037,7 @@
           <w:rFonts w:ascii="Calibri" w:hAnsi="Calibri"/>
           <w:sz w:val="21"/>
         </w:rPr>
-        <w:t>5 outil(s) de compression/caching identifie(s) - tester pour reduire les tokens avant envoi a l API.</w:t>
+        <w:t>2 outil(s) de compression ou de cache identifie(s) - a tester pour reduire les tokens envoyes a l'API.</w:t>
       </w:r>
     </w:p>
     <w:p>
@@ -2817,7 +2050,7 @@
           <w:rFonts w:ascii="Calibri" w:hAnsi="Calibri"/>
           <w:sz w:val="21"/>
         </w:rPr>
-        <w:t>2 source(s) sur le FinOps IA - alimente la partie conseil de TokenForge (tableau de bord couts, alertes, plafonds).</w:t>
+        <w:t>2 source(s) sur la maitrise des couts IA - utile pour le volet conseil de TokenForge (tableau de bord couts, alertes, plafonds).</w:t>
       </w:r>
     </w:p>
     <w:p>
@@ -2830,7 +2063,7 @@
           <w:rFonts w:ascii="Calibri" w:hAnsi="Calibri"/>
           <w:sz w:val="21"/>
         </w:rPr>
-        <w:t>Prochaine etape : monter un petit comparatif des providers (OpenAI vs Anthropic vs Mistral vs Google) avec les prix token 2026 pour les clients TokenForge.</w:t>
+        <w:t>Prochaine etape : monter un petit comparatif des fournisseurs (OpenAI vs Anthropic vs Mistral vs Google) avec les prix token 2026 pour les clients TokenForge.</w:t>
       </w:r>
     </w:p>
     <w:sectPr>

</xml_diff>